<commit_message>
[update] Colocando info do artigo CDHIS
Adicionando mais informações obtidas pela leitura do artigo de Adriana de Carvalho Medeiros
</commit_message>
<xml_diff>
--- a/2026/pesquisas/PesquisaBrasileirosRelacionamComHistoria.docx
+++ b/2026/pesquisas/PesquisaBrasileirosRelacionamComHistoria.docx
@@ -152,55 +152,19 @@
         <w:rPr>
           <w:rFonts w:ascii="Arial" w:hAnsi="Arial" w:cs="Arial"/>
         </w:rPr>
-        <w:t xml:space="preserve">), </w:t>
-      </w:r>
-      <w:proofErr w:type="spellStart"/>
-      <w:r>
-        <w:rPr>
-          <w:rFonts w:ascii="Arial" w:hAnsi="Arial" w:cs="Arial"/>
-        </w:rPr>
-        <w:t>Djamila</w:t>
-      </w:r>
-      <w:proofErr w:type="spellEnd"/>
-      <w:r>
-        <w:rPr>
-          <w:rFonts w:ascii="Arial" w:hAnsi="Arial" w:cs="Arial"/>
-        </w:rPr>
-        <w:t xml:space="preserve"> Ribeiro e </w:t>
-      </w:r>
-      <w:r>
-        <w:rPr>
-          <w:rFonts w:ascii="Arial" w:hAnsi="Arial" w:cs="Arial"/>
-        </w:rPr>
-        <w:t xml:space="preserve">Erica </w:t>
-      </w:r>
-      <w:proofErr w:type="spellStart"/>
-      <w:r>
-        <w:rPr>
-          <w:rFonts w:ascii="Arial" w:hAnsi="Arial" w:cs="Arial"/>
-        </w:rPr>
-        <w:t>Malunguinho</w:t>
-      </w:r>
-      <w:proofErr w:type="spellEnd"/>
-      <w:r>
-        <w:rPr>
-          <w:rFonts w:ascii="Arial" w:hAnsi="Arial" w:cs="Arial"/>
-        </w:rPr>
-        <w:t xml:space="preserve"> falam sobre ancestralidade. Elas comentaram, começando por </w:t>
-      </w:r>
-      <w:proofErr w:type="spellStart"/>
-      <w:r>
-        <w:rPr>
-          <w:rFonts w:ascii="Arial" w:hAnsi="Arial" w:cs="Arial"/>
-        </w:rPr>
-        <w:t>Djamila</w:t>
-      </w:r>
-      <w:proofErr w:type="spellEnd"/>
-      <w:r>
-        <w:rPr>
-          <w:rFonts w:ascii="Arial" w:hAnsi="Arial" w:cs="Arial"/>
-        </w:rPr>
-        <w:t xml:space="preserve">: </w:t>
+        <w:t xml:space="preserve">), Djamila Ribeiro e </w:t>
+      </w:r>
+      <w:r>
+        <w:rPr>
+          <w:rFonts w:ascii="Arial" w:hAnsi="Arial" w:cs="Arial"/>
+        </w:rPr>
+        <w:t>Erica Malunguinho</w:t>
+      </w:r>
+      <w:r>
+        <w:rPr>
+          <w:rFonts w:ascii="Arial" w:hAnsi="Arial" w:cs="Arial"/>
+        </w:rPr>
+        <w:t xml:space="preserve"> falam sobre ancestralidade. Elas comentaram, começando por Djamila: </w:t>
       </w:r>
       <w:r>
         <w:rPr>
@@ -229,19 +193,32 @@
           <w:szCs w:val="24"/>
           <w:lang w:eastAsia="pt-BR"/>
         </w:rPr>
-        <w:t xml:space="preserve">Erica </w:t>
-      </w:r>
-      <w:proofErr w:type="spellStart"/>
-      <w:r>
+        <w:t>Erica Malunguinho segue a mesma linha de raciocínio. Para a deputada, o legado dos antepassados une os tempos. “A ancestralidade é o elo entre passado, presente e futuro. O amanhã será ancestral um dia”.</w:t>
+      </w:r>
+    </w:p>
+    <w:p>
+      <w:pPr>
+        <w:spacing w:after="0" w:line="360" w:lineRule="auto"/>
+        <w:jc w:val="both"/>
+        <w:textAlignment w:val="baseline"/>
         <w:rPr>
           <w:rFonts w:ascii="Arial" w:eastAsia="Times New Roman" w:hAnsi="Arial" w:cs="Arial"/>
           <w:sz w:val="24"/>
           <w:szCs w:val="24"/>
           <w:lang w:eastAsia="pt-BR"/>
         </w:rPr>
-        <w:t>Malunguinho</w:t>
-      </w:r>
-      <w:proofErr w:type="spellEnd"/>
+      </w:pPr>
+    </w:p>
+    <w:p>
+      <w:pPr>
+        <w:spacing w:after="0" w:line="360" w:lineRule="auto"/>
+        <w:jc w:val="both"/>
+        <w:textAlignment w:val="baseline"/>
+        <w:rPr>
+          <w:rFonts w:ascii="Arial" w:hAnsi="Arial" w:cs="Arial"/>
+          <w:sz w:val="24"/>
+        </w:rPr>
+      </w:pPr>
       <w:r>
         <w:rPr>
           <w:rFonts w:ascii="Arial" w:eastAsia="Times New Roman" w:hAnsi="Arial" w:cs="Arial"/>
@@ -249,7 +226,92 @@
           <w:szCs w:val="24"/>
           <w:lang w:eastAsia="pt-BR"/>
         </w:rPr>
-        <w:t xml:space="preserve"> segue a mesma linha de raciocínio. Para a deputada, o legado dos antepassados une os tempos. “A ancestralidade é o elo entre passado, presente e futuro. O amanhã será ancestral um dia”.</w:t>
+        <w:t xml:space="preserve">Em </w:t>
+      </w:r>
+      <w:r>
+        <w:rPr>
+          <w:rFonts w:ascii="Arial" w:eastAsia="Times New Roman" w:hAnsi="Arial" w:cs="Arial"/>
+          <w:i/>
+          <w:sz w:val="24"/>
+          <w:szCs w:val="24"/>
+          <w:lang w:eastAsia="pt-BR"/>
+        </w:rPr>
+        <w:t>Um breve histórico sobre o ensino de História no Brasil</w:t>
+      </w:r>
+      <w:r>
+        <w:rPr>
+          <w:rFonts w:ascii="Arial" w:eastAsia="Times New Roman" w:hAnsi="Arial" w:cs="Arial"/>
+          <w:i/>
+          <w:sz w:val="24"/>
+          <w:szCs w:val="24"/>
+          <w:lang w:eastAsia="pt-BR"/>
+        </w:rPr>
+        <w:t xml:space="preserve">, </w:t>
+      </w:r>
+      <w:r>
+        <w:rPr>
+          <w:rFonts w:ascii="Arial" w:hAnsi="Arial" w:cs="Arial"/>
+          <w:sz w:val="24"/>
+        </w:rPr>
+        <w:t>Adriana de Carvalho Medeiros</w:t>
+      </w:r>
+      <w:r>
+        <w:rPr>
+          <w:rFonts w:ascii="Arial" w:hAnsi="Arial" w:cs="Arial"/>
+          <w:sz w:val="24"/>
+        </w:rPr>
+        <w:t xml:space="preserve"> explica como a disciplina de História é aborda</w:t>
+      </w:r>
+      <w:r>
+        <w:rPr>
+          <w:rFonts w:ascii="Arial" w:hAnsi="Arial" w:cs="Arial"/>
+          <w:sz w:val="24"/>
+        </w:rPr>
+        <w:t>da no século XXI em decorrênci</w:t>
+      </w:r>
+      <w:r>
+        <w:rPr>
+          <w:rFonts w:ascii="Arial" w:hAnsi="Arial" w:cs="Arial"/>
+          <w:sz w:val="24"/>
+        </w:rPr>
+        <w:t>a</w:t>
+      </w:r>
+      <w:r>
+        <w:rPr>
+          <w:rFonts w:ascii="Arial" w:hAnsi="Arial" w:cs="Arial"/>
+          <w:sz w:val="24"/>
+        </w:rPr>
+        <w:t xml:space="preserve"> de</w:t>
+      </w:r>
+      <w:r>
+        <w:rPr>
+          <w:rFonts w:ascii="Arial" w:hAnsi="Arial" w:cs="Arial"/>
+          <w:sz w:val="24"/>
+        </w:rPr>
+        <w:t xml:space="preserve"> acontecimentos anter</w:t>
+      </w:r>
+      <w:r>
+        <w:rPr>
+          <w:rFonts w:ascii="Arial" w:hAnsi="Arial" w:cs="Arial"/>
+          <w:sz w:val="24"/>
+        </w:rPr>
+        <w:t xml:space="preserve">iores, </w:t>
+      </w:r>
+      <w:r>
+        <w:rPr>
+          <w:rFonts w:ascii="Arial" w:hAnsi="Arial" w:cs="Arial"/>
+          <w:sz w:val="24"/>
+        </w:rPr>
+        <w:t>como a Independência do Brasil e a Ditadura Milita</w:t>
+      </w:r>
+      <w:bookmarkStart w:id="0" w:name="_GoBack"/>
+      <w:bookmarkEnd w:id="0"/>
+      <w:r>
+        <w:rPr>
+          <w:rFonts w:ascii="Arial" w:hAnsi="Arial" w:cs="Arial"/>
+          <w:sz w:val="24"/>
+        </w:rPr>
+        <w:t>r. Assim, ela traz um profundo contexto histórico que reflete em como os brasileiros enxergam e entendem a sua própria história.</w:t>
       </w:r>
     </w:p>
     <w:p>
@@ -258,10 +320,559 @@
         <w:jc w:val="both"/>
         <w:textAlignment w:val="baseline"/>
         <w:rPr>
+          <w:rFonts w:ascii="Arial" w:hAnsi="Arial" w:cs="Arial"/>
+          <w:sz w:val="24"/>
+        </w:rPr>
+      </w:pPr>
+      <w:r>
+        <w:rPr>
+          <w:rFonts w:ascii="Arial" w:hAnsi="Arial" w:cs="Arial"/>
+          <w:sz w:val="24"/>
+        </w:rPr>
+        <w:t xml:space="preserve">A historiadora também conta como nações e instituições internacionais como </w:t>
+      </w:r>
+      <w:r>
+        <w:rPr>
+          <w:rFonts w:ascii="Arial" w:hAnsi="Arial" w:cs="Arial"/>
+          <w:sz w:val="24"/>
+        </w:rPr>
+        <w:t>UNESCO; BIRD, UNICEF, BNUD e Banco Mundia</w:t>
+      </w:r>
+      <w:r>
+        <w:rPr>
+          <w:rFonts w:ascii="Arial" w:hAnsi="Arial" w:cs="Arial"/>
+          <w:sz w:val="24"/>
+        </w:rPr>
+        <w:t>l “</w:t>
+      </w:r>
+      <w:r>
+        <w:rPr>
+          <w:rFonts w:ascii="Arial" w:hAnsi="Arial" w:cs="Arial"/>
+          <w:sz w:val="24"/>
+        </w:rPr>
+        <w:t>impuseram uma educação não em consonância as expectativas e</w:t>
+      </w:r>
+      <w:r>
+        <w:rPr>
+          <w:rFonts w:ascii="Arial" w:hAnsi="Arial" w:cs="Arial"/>
+          <w:sz w:val="24"/>
+        </w:rPr>
+        <w:t xml:space="preserve"> </w:t>
+      </w:r>
+      <w:r>
+        <w:rPr>
+          <w:rFonts w:ascii="Arial" w:hAnsi="Arial" w:cs="Arial"/>
+          <w:sz w:val="24"/>
+        </w:rPr>
+        <w:t xml:space="preserve">necessidade latino-americanas, mas sim, relacionadas as expectativas dos países metropolitanos. Segundo Libâneo </w:t>
+      </w:r>
+      <w:r>
+        <w:rPr>
+          <w:rFonts w:ascii="Arial" w:hAnsi="Arial" w:cs="Arial"/>
+          <w:sz w:val="24"/>
+        </w:rPr>
+        <w:lastRenderedPageBreak/>
+        <w:t xml:space="preserve">(2012, p.13), a crise educacional vivida no final do século XX e início do XXI, é resultado da orientação de documentos produzidos por estes organismos </w:t>
+      </w:r>
+      <w:r>
+        <w:rPr>
+          <w:rFonts w:ascii="Arial" w:hAnsi="Arial" w:cs="Arial"/>
+          <w:sz w:val="24"/>
+        </w:rPr>
+        <w:t xml:space="preserve">[...]“ </w:t>
+      </w:r>
+    </w:p>
+    <w:p>
+      <w:pPr>
+        <w:spacing w:after="0" w:line="360" w:lineRule="auto"/>
+        <w:jc w:val="both"/>
+        <w:textAlignment w:val="baseline"/>
+        <w:rPr>
+          <w:rFonts w:ascii="Arial" w:hAnsi="Arial" w:cs="Arial"/>
+          <w:sz w:val="24"/>
+        </w:rPr>
+      </w:pPr>
+    </w:p>
+    <w:p>
+      <w:pPr>
+        <w:spacing w:after="0" w:line="360" w:lineRule="auto"/>
+        <w:jc w:val="both"/>
+        <w:textAlignment w:val="baseline"/>
+        <w:rPr>
+          <w:rFonts w:ascii="Arial" w:hAnsi="Arial" w:cs="Arial"/>
+          <w:sz w:val="24"/>
+        </w:rPr>
+      </w:pPr>
+      <w:r>
+        <w:rPr>
+          <w:rFonts w:ascii="Arial" w:hAnsi="Arial" w:cs="Arial"/>
+          <w:sz w:val="24"/>
+        </w:rPr>
+        <w:t>Além disso, o ensino de História tinha como objetivo fortalecer ideai</w:t>
+      </w:r>
+      <w:r>
+        <w:rPr>
+          <w:rFonts w:ascii="Arial" w:hAnsi="Arial" w:cs="Arial"/>
+          <w:sz w:val="24"/>
+        </w:rPr>
+        <w:t xml:space="preserve">s nacionais; </w:t>
+      </w:r>
+      <w:r>
+        <w:rPr>
+          <w:rFonts w:ascii="Arial" w:hAnsi="Arial" w:cs="Arial"/>
+          <w:sz w:val="24"/>
+        </w:rPr>
+        <w:t>priv</w:t>
+      </w:r>
+      <w:r>
+        <w:rPr>
+          <w:rFonts w:ascii="Arial" w:hAnsi="Arial" w:cs="Arial"/>
+          <w:sz w:val="24"/>
+        </w:rPr>
+        <w:t>ilegiava a classe dominante</w:t>
+      </w:r>
+      <w:r>
+        <w:rPr>
+          <w:rFonts w:ascii="Arial" w:hAnsi="Arial" w:cs="Arial"/>
+          <w:sz w:val="24"/>
+        </w:rPr>
+        <w:t xml:space="preserve"> </w:t>
+      </w:r>
+      <w:r>
+        <w:rPr>
+          <w:rFonts w:ascii="Arial" w:hAnsi="Arial" w:cs="Arial"/>
+          <w:sz w:val="24"/>
+        </w:rPr>
+        <w:t xml:space="preserve">e inviabilizava os povos originários e africanos escravizados. </w:t>
+      </w:r>
+    </w:p>
+    <w:p>
+      <w:pPr>
+        <w:spacing w:after="0" w:line="360" w:lineRule="auto"/>
+        <w:jc w:val="both"/>
+        <w:textAlignment w:val="baseline"/>
+        <w:rPr>
+          <w:rFonts w:ascii="Arial" w:hAnsi="Arial" w:cs="Arial"/>
+          <w:sz w:val="24"/>
+        </w:rPr>
+      </w:pPr>
+      <w:r>
+        <w:rPr>
+          <w:rFonts w:ascii="Arial" w:hAnsi="Arial" w:cs="Arial"/>
+          <w:sz w:val="24"/>
+        </w:rPr>
+        <w:t xml:space="preserve">Sobre o período do Império, Adriana conta: “ </w:t>
+      </w:r>
+      <w:r>
+        <w:rPr>
+          <w:rFonts w:ascii="Arial" w:hAnsi="Arial" w:cs="Arial"/>
+          <w:sz w:val="24"/>
+          <w:szCs w:val="24"/>
+        </w:rPr>
+        <w:t xml:space="preserve">No Colégio D. Pedro II, a implantação da disciplina de História baseou se no modelo francês, ou seja, com base na escola positivista. Assim, os conteúdos eram os referentes a História do mundo Ocidental, excluindo a História do Brasil, que era compreendida neste momento, como uma extensão da História da Europa Ocidental. Fez-se uma preferência pela História Universal em deterioração da História Nacional. A preferência pela História Clássica (e modelo tripartite), reforçava o elitismo, ao excluir da narrativa histórica construída no ensino de história, de grupos importantes para compreensão da sociedade e realidade brasileira, como os povos indígenas, trabalhadores pobres, e trabalhadores africanos escravizados. Reproduzia desta forma, a enorme desigualdade que existia no Brasil durante o </w:t>
+      </w:r>
+      <w:r>
+        <w:rPr>
+          <w:rFonts w:ascii="Arial" w:hAnsi="Arial" w:cs="Arial"/>
+          <w:sz w:val="24"/>
+          <w:szCs w:val="24"/>
+        </w:rPr>
+        <w:t>Império.</w:t>
+      </w:r>
+      <w:r>
+        <w:t xml:space="preserve"> ”</w:t>
+      </w:r>
+      <w:r>
+        <w:rPr>
+          <w:rFonts w:ascii="Arial" w:hAnsi="Arial" w:cs="Arial"/>
+          <w:sz w:val="24"/>
+        </w:rPr>
+        <w:t xml:space="preserve"> </w:t>
+      </w:r>
+    </w:p>
+    <w:p>
+      <w:pPr>
+        <w:spacing w:after="0" w:line="360" w:lineRule="auto"/>
+        <w:jc w:val="both"/>
+        <w:textAlignment w:val="baseline"/>
+      </w:pPr>
+      <w:r>
+        <w:rPr>
+          <w:rFonts w:ascii="Arial" w:hAnsi="Arial" w:cs="Arial"/>
+          <w:sz w:val="24"/>
+        </w:rPr>
+        <w:t xml:space="preserve">Já durante a Ditadura Militar, “ </w:t>
+      </w:r>
+      <w:r>
+        <w:rPr>
+          <w:rFonts w:ascii="Arial" w:hAnsi="Arial" w:cs="Arial"/>
+          <w:sz w:val="24"/>
+        </w:rPr>
+        <w:t>Na década de 1970, o ensino de História era baseado no método tradicional e ensinada de forma linear, cronológica e acrítica; as aulas eram expositivas, baseadas na reprodução e memorização dos fatos históricos e “heróis” nacionais.</w:t>
+      </w:r>
+      <w:r>
+        <w:t xml:space="preserve"> ”</w:t>
+      </w:r>
+    </w:p>
+    <w:p>
+      <w:pPr>
+        <w:spacing w:after="0" w:line="360" w:lineRule="auto"/>
+        <w:jc w:val="both"/>
+        <w:textAlignment w:val="baseline"/>
+        <w:rPr>
+          <w:rFonts w:ascii="Arial" w:hAnsi="Arial" w:cs="Arial"/>
+          <w:sz w:val="24"/>
+          <w:szCs w:val="24"/>
+        </w:rPr>
+      </w:pPr>
+      <w:r>
+        <w:rPr>
+          <w:rFonts w:ascii="Arial" w:hAnsi="Arial" w:cs="Arial"/>
+          <w:sz w:val="24"/>
+          <w:szCs w:val="24"/>
+        </w:rPr>
+        <w:t>Há também a pauta sobre a BNCC (Base Nacional Comum Curricular), Adriana comenta “</w:t>
+      </w:r>
+      <w:r>
+        <w:rPr>
+          <w:rFonts w:ascii="Arial" w:hAnsi="Arial" w:cs="Arial"/>
+          <w:sz w:val="24"/>
+          <w:szCs w:val="24"/>
+        </w:rPr>
+        <w:t>Em 2018 após intenso debate foi homologado a versão do BNCC. Os críticos a BNCC, indicam que o documento normativo que deveria definir habilidades e competências básicas, que o estudante deveria desenvolver ao longo de sua formação na educação básica, se tornou na verdade, um manual de quais conteúdos deveriam ser ensinados</w:t>
+      </w:r>
+      <w:r>
+        <w:rPr>
+          <w:rFonts w:ascii="Arial" w:hAnsi="Arial" w:cs="Arial"/>
+          <w:sz w:val="24"/>
+          <w:szCs w:val="24"/>
+        </w:rPr>
+        <w:t>. ”</w:t>
+      </w:r>
+    </w:p>
+    <w:p>
+      <w:pPr>
+        <w:spacing w:after="0" w:line="360" w:lineRule="auto"/>
+        <w:jc w:val="both"/>
+        <w:textAlignment w:val="baseline"/>
+        <w:rPr>
+          <w:rFonts w:ascii="Arial" w:hAnsi="Arial" w:cs="Arial"/>
+          <w:sz w:val="24"/>
+          <w:szCs w:val="24"/>
+        </w:rPr>
+      </w:pPr>
+      <w:r>
+        <w:rPr>
+          <w:rFonts w:ascii="Arial" w:hAnsi="Arial" w:cs="Arial"/>
+          <w:sz w:val="24"/>
+          <w:szCs w:val="24"/>
+        </w:rPr>
+        <w:t>Assim, dentre o que ela disserta há a questão da atuação do professor, e na sua conclusão ela termina dizendo: “</w:t>
+      </w:r>
+      <w:r>
+        <w:rPr>
+          <w:rFonts w:ascii="Arial" w:hAnsi="Arial" w:cs="Arial"/>
+          <w:sz w:val="24"/>
+          <w:szCs w:val="24"/>
+        </w:rPr>
+        <w:t>o grande desafio do professor no tempo presente, para além de garantir a existência e permanecia da História como disciplina no currículo escolar, está a</w:t>
+      </w:r>
+      <w:r>
+        <w:rPr>
+          <w:rFonts w:ascii="Arial" w:hAnsi="Arial" w:cs="Arial"/>
+          <w:sz w:val="24"/>
+          <w:szCs w:val="24"/>
+        </w:rPr>
+        <w:t xml:space="preserve"> </w:t>
+      </w:r>
+      <w:r>
+        <w:rPr>
+          <w:rFonts w:ascii="Arial" w:hAnsi="Arial" w:cs="Arial"/>
+          <w:sz w:val="24"/>
+          <w:szCs w:val="24"/>
+        </w:rPr>
+        <w:t xml:space="preserve">luta por garantir que não ocorra um esvaziamento da disciplina, seja de seu conteúdo político, seja do seu teor </w:t>
+      </w:r>
+      <w:r>
+        <w:rPr>
+          <w:rFonts w:ascii="Arial" w:hAnsi="Arial" w:cs="Arial"/>
+          <w:sz w:val="24"/>
+          <w:szCs w:val="24"/>
+        </w:rPr>
+        <w:lastRenderedPageBreak/>
+        <w:t xml:space="preserve">significativo para combater o falseamento da história vivida. Esses são capítulos da História da disciplina de História que ainda estão sendo </w:t>
+      </w:r>
+      <w:proofErr w:type="gramStart"/>
+      <w:r>
+        <w:rPr>
+          <w:rFonts w:ascii="Arial" w:hAnsi="Arial" w:cs="Arial"/>
+          <w:sz w:val="24"/>
+          <w:szCs w:val="24"/>
+        </w:rPr>
+        <w:t>escritos.</w:t>
+      </w:r>
+      <w:r>
+        <w:rPr>
+          <w:rFonts w:ascii="Arial" w:hAnsi="Arial" w:cs="Arial"/>
+          <w:sz w:val="24"/>
+          <w:szCs w:val="24"/>
+        </w:rPr>
+        <w:t>”</w:t>
+      </w:r>
+      <w:proofErr w:type="gramEnd"/>
+    </w:p>
+    <w:p>
+      <w:pPr>
+        <w:spacing w:after="0" w:line="360" w:lineRule="auto"/>
+        <w:jc w:val="both"/>
+        <w:textAlignment w:val="baseline"/>
+        <w:rPr>
           <w:rFonts w:ascii="Arial" w:eastAsia="Times New Roman" w:hAnsi="Arial" w:cs="Arial"/>
           <w:sz w:val="24"/>
           <w:szCs w:val="24"/>
           <w:lang w:eastAsia="pt-BR"/>
+        </w:rPr>
+      </w:pPr>
+    </w:p>
+    <w:p>
+      <w:pPr>
+        <w:spacing w:after="0" w:line="360" w:lineRule="auto"/>
+        <w:jc w:val="both"/>
+        <w:rPr>
+          <w:rFonts w:ascii="Arial" w:hAnsi="Arial" w:cs="Arial"/>
+          <w:sz w:val="24"/>
+          <w:szCs w:val="24"/>
+        </w:rPr>
+      </w:pPr>
+    </w:p>
+    <w:p>
+      <w:pPr>
+        <w:spacing w:after="0" w:line="360" w:lineRule="auto"/>
+        <w:jc w:val="both"/>
+        <w:rPr>
+          <w:rFonts w:ascii="Arial" w:hAnsi="Arial" w:cs="Arial"/>
+          <w:sz w:val="24"/>
+          <w:szCs w:val="24"/>
+        </w:rPr>
+      </w:pPr>
+    </w:p>
+    <w:p>
+      <w:pPr>
+        <w:spacing w:after="0" w:line="360" w:lineRule="auto"/>
+        <w:jc w:val="both"/>
+        <w:rPr>
+          <w:rFonts w:ascii="Arial" w:hAnsi="Arial" w:cs="Arial"/>
+          <w:sz w:val="24"/>
+          <w:szCs w:val="24"/>
+        </w:rPr>
+      </w:pPr>
+    </w:p>
+    <w:p>
+      <w:pPr>
+        <w:spacing w:after="0" w:line="360" w:lineRule="auto"/>
+        <w:jc w:val="both"/>
+        <w:rPr>
+          <w:rFonts w:ascii="Arial" w:hAnsi="Arial" w:cs="Arial"/>
+          <w:sz w:val="24"/>
+          <w:szCs w:val="24"/>
+        </w:rPr>
+      </w:pPr>
+    </w:p>
+    <w:p>
+      <w:pPr>
+        <w:spacing w:after="0" w:line="360" w:lineRule="auto"/>
+        <w:jc w:val="both"/>
+        <w:rPr>
+          <w:rFonts w:ascii="Arial" w:hAnsi="Arial" w:cs="Arial"/>
+          <w:sz w:val="24"/>
+          <w:szCs w:val="24"/>
+        </w:rPr>
+      </w:pPr>
+    </w:p>
+    <w:p>
+      <w:pPr>
+        <w:spacing w:after="0" w:line="360" w:lineRule="auto"/>
+        <w:jc w:val="both"/>
+        <w:rPr>
+          <w:rFonts w:ascii="Arial" w:hAnsi="Arial" w:cs="Arial"/>
+          <w:sz w:val="24"/>
+          <w:szCs w:val="24"/>
+        </w:rPr>
+      </w:pPr>
+    </w:p>
+    <w:p>
+      <w:pPr>
+        <w:spacing w:after="0" w:line="360" w:lineRule="auto"/>
+        <w:jc w:val="both"/>
+        <w:rPr>
+          <w:rFonts w:ascii="Arial" w:hAnsi="Arial" w:cs="Arial"/>
+          <w:sz w:val="24"/>
+          <w:szCs w:val="24"/>
+        </w:rPr>
+      </w:pPr>
+    </w:p>
+    <w:p>
+      <w:pPr>
+        <w:spacing w:after="0" w:line="360" w:lineRule="auto"/>
+        <w:jc w:val="both"/>
+        <w:rPr>
+          <w:rFonts w:ascii="Arial" w:hAnsi="Arial" w:cs="Arial"/>
+          <w:sz w:val="24"/>
+          <w:szCs w:val="24"/>
+        </w:rPr>
+      </w:pPr>
+    </w:p>
+    <w:p>
+      <w:pPr>
+        <w:spacing w:after="0" w:line="360" w:lineRule="auto"/>
+        <w:jc w:val="both"/>
+        <w:rPr>
+          <w:rFonts w:ascii="Arial" w:hAnsi="Arial" w:cs="Arial"/>
+          <w:sz w:val="24"/>
+          <w:szCs w:val="24"/>
+        </w:rPr>
+      </w:pPr>
+    </w:p>
+    <w:p>
+      <w:pPr>
+        <w:spacing w:after="0" w:line="360" w:lineRule="auto"/>
+        <w:jc w:val="both"/>
+        <w:rPr>
+          <w:rFonts w:ascii="Arial" w:hAnsi="Arial" w:cs="Arial"/>
+          <w:sz w:val="24"/>
+          <w:szCs w:val="24"/>
+        </w:rPr>
+      </w:pPr>
+    </w:p>
+    <w:p>
+      <w:pPr>
+        <w:spacing w:after="0" w:line="360" w:lineRule="auto"/>
+        <w:jc w:val="both"/>
+        <w:rPr>
+          <w:rFonts w:ascii="Arial" w:hAnsi="Arial" w:cs="Arial"/>
+          <w:sz w:val="24"/>
+          <w:szCs w:val="24"/>
+        </w:rPr>
+      </w:pPr>
+    </w:p>
+    <w:p>
+      <w:pPr>
+        <w:spacing w:after="0" w:line="360" w:lineRule="auto"/>
+        <w:jc w:val="both"/>
+        <w:rPr>
+          <w:rFonts w:ascii="Arial" w:hAnsi="Arial" w:cs="Arial"/>
+          <w:sz w:val="24"/>
+          <w:szCs w:val="24"/>
+        </w:rPr>
+      </w:pPr>
+    </w:p>
+    <w:p>
+      <w:pPr>
+        <w:spacing w:after="0" w:line="360" w:lineRule="auto"/>
+        <w:jc w:val="both"/>
+        <w:rPr>
+          <w:rFonts w:ascii="Arial" w:hAnsi="Arial" w:cs="Arial"/>
+          <w:sz w:val="24"/>
+          <w:szCs w:val="24"/>
+        </w:rPr>
+      </w:pPr>
+    </w:p>
+    <w:p>
+      <w:pPr>
+        <w:spacing w:after="0" w:line="360" w:lineRule="auto"/>
+        <w:jc w:val="both"/>
+        <w:rPr>
+          <w:rFonts w:ascii="Arial" w:hAnsi="Arial" w:cs="Arial"/>
+          <w:sz w:val="24"/>
+          <w:szCs w:val="24"/>
+        </w:rPr>
+      </w:pPr>
+    </w:p>
+    <w:p>
+      <w:pPr>
+        <w:spacing w:after="0" w:line="360" w:lineRule="auto"/>
+        <w:jc w:val="both"/>
+        <w:rPr>
+          <w:rFonts w:ascii="Arial" w:hAnsi="Arial" w:cs="Arial"/>
+          <w:sz w:val="24"/>
+          <w:szCs w:val="24"/>
+        </w:rPr>
+      </w:pPr>
+    </w:p>
+    <w:p>
+      <w:pPr>
+        <w:spacing w:after="0" w:line="360" w:lineRule="auto"/>
+        <w:jc w:val="both"/>
+        <w:rPr>
+          <w:rFonts w:ascii="Arial" w:hAnsi="Arial" w:cs="Arial"/>
+          <w:sz w:val="24"/>
+          <w:szCs w:val="24"/>
+        </w:rPr>
+      </w:pPr>
+    </w:p>
+    <w:p>
+      <w:pPr>
+        <w:spacing w:after="0" w:line="360" w:lineRule="auto"/>
+        <w:jc w:val="both"/>
+        <w:rPr>
+          <w:rFonts w:ascii="Arial" w:hAnsi="Arial" w:cs="Arial"/>
+          <w:sz w:val="24"/>
+          <w:szCs w:val="24"/>
+        </w:rPr>
+      </w:pPr>
+    </w:p>
+    <w:p>
+      <w:pPr>
+        <w:spacing w:after="0" w:line="360" w:lineRule="auto"/>
+        <w:jc w:val="both"/>
+        <w:rPr>
+          <w:rFonts w:ascii="Arial" w:hAnsi="Arial" w:cs="Arial"/>
+          <w:sz w:val="24"/>
+          <w:szCs w:val="24"/>
+        </w:rPr>
+      </w:pPr>
+    </w:p>
+    <w:p>
+      <w:pPr>
+        <w:spacing w:after="0" w:line="360" w:lineRule="auto"/>
+        <w:jc w:val="both"/>
+        <w:rPr>
+          <w:rFonts w:ascii="Arial" w:hAnsi="Arial" w:cs="Arial"/>
+          <w:sz w:val="24"/>
+          <w:szCs w:val="24"/>
+        </w:rPr>
+      </w:pPr>
+    </w:p>
+    <w:p>
+      <w:pPr>
+        <w:spacing w:after="0" w:line="360" w:lineRule="auto"/>
+        <w:jc w:val="both"/>
+        <w:rPr>
+          <w:rFonts w:ascii="Arial" w:hAnsi="Arial" w:cs="Arial"/>
+          <w:sz w:val="24"/>
+          <w:szCs w:val="24"/>
+        </w:rPr>
+      </w:pPr>
+    </w:p>
+    <w:p>
+      <w:pPr>
+        <w:spacing w:after="0" w:line="360" w:lineRule="auto"/>
+        <w:jc w:val="both"/>
+        <w:rPr>
+          <w:rFonts w:ascii="Arial" w:hAnsi="Arial" w:cs="Arial"/>
+          <w:sz w:val="24"/>
+          <w:szCs w:val="24"/>
+        </w:rPr>
+      </w:pPr>
+    </w:p>
+    <w:p>
+      <w:pPr>
+        <w:spacing w:after="0" w:line="360" w:lineRule="auto"/>
+        <w:jc w:val="both"/>
+        <w:rPr>
+          <w:rFonts w:ascii="Arial" w:hAnsi="Arial" w:cs="Arial"/>
+          <w:sz w:val="24"/>
+          <w:szCs w:val="24"/>
         </w:rPr>
       </w:pPr>
     </w:p>
@@ -535,8 +1146,6 @@
           <w:rFonts w:ascii="Arial" w:hAnsi="Arial" w:cs="Arial"/>
         </w:rPr>
       </w:pPr>
-      <w:bookmarkStart w:id="0" w:name="_GoBack"/>
-      <w:bookmarkEnd w:id="0"/>
     </w:p>
     <w:sectPr>
       <w:pgSz w:w="11906" w:h="16838"/>

</xml_diff>